<commit_message>
Refine heading hierarchy: modules H1, lectures H2, subsections H3
</commit_message>
<xml_diff>
--- a/Результаты/методичка_трансформаторы.docx
+++ b/Результаты/методичка_трансформаторы.docx
@@ -230,15 +230,15 @@
     </w:p>
     <w:p>
       <w:pPr>
+        <w:pStyle w:val="Heading1"/>
+      </w:pPr>
+      <w:r>
+        <w:t>Модуль I. Физические основы и конструкция силовых трансформаторов</w:t>
+      </w:r>
+    </w:p>
+    <w:p>
+      <w:pPr>
         <w:pStyle w:val="Heading2"/>
-      </w:pPr>
-      <w:r>
-        <w:t>Модуль I. Физические основы и конструкция силовых трансформаторов</w:t>
-      </w:r>
-    </w:p>
-    <w:p>
-      <w:pPr>
-        <w:pStyle w:val="Heading3"/>
       </w:pPr>
       <w:r>
         <w:t>Лекция 1. Электромагнитные процессы и принцип действия трансформатора</w:t>
@@ -1142,7 +1142,7 @@
     </w:p>
     <w:p>
       <w:pPr>
-        <w:pStyle w:val="Heading3"/>
+        <w:pStyle w:val="Heading2"/>
       </w:pPr>
       <w:r>
         <w:t>Лекция 2. Конструкция активной части: магнитопровод и обмотки</w:t>
@@ -1449,7 +1449,7 @@
     </w:p>
     <w:p>
       <w:pPr>
-        <w:pStyle w:val="Heading3"/>
+        <w:pStyle w:val="Heading2"/>
       </w:pPr>
       <w:r>
         <w:t>Лекция 3. Конструктивные элементы, системы охлаждения и защита</w:t>
@@ -2036,15 +2036,15 @@
     </w:p>
     <w:p>
       <w:pPr>
+        <w:pStyle w:val="Heading1"/>
+      </w:pPr>
+      <w:r>
+        <w:t>Модуль II. Математические модели и схемы замещения</w:t>
+      </w:r>
+    </w:p>
+    <w:p>
+      <w:pPr>
         <w:pStyle w:val="Heading2"/>
-      </w:pPr>
-      <w:r>
-        <w:t>Модуль II. Математические модели и схемы замещения</w:t>
-      </w:r>
-    </w:p>
-    <w:p>
-      <w:pPr>
-        <w:pStyle w:val="Heading3"/>
       </w:pPr>
       <w:r>
         <w:t>Лекция 4. Уравнения электрического и магнитного равновесия трансформатора</w:t>
@@ -2839,7 +2839,7 @@
     </w:p>
     <w:p>
       <w:pPr>
-        <w:pStyle w:val="Heading3"/>
+        <w:pStyle w:val="Heading2"/>
       </w:pPr>
       <w:r>
         <w:t>Лекция 5. Электрические схемы замещения и векторные диаграммы</w:t>
@@ -3953,15 +3953,15 @@
     </w:p>
     <w:p>
       <w:pPr>
+        <w:pStyle w:val="Heading1"/>
+      </w:pPr>
+      <w:r>
+        <w:t>Модуль III. Режимы работы, потери и КПД</w:t>
+      </w:r>
+    </w:p>
+    <w:p>
+      <w:pPr>
         <w:pStyle w:val="Heading2"/>
-      </w:pPr>
-      <w:r>
-        <w:t>Модуль III. Режимы работы, потери и КПД</w:t>
-      </w:r>
-    </w:p>
-    <w:p>
-      <w:pPr>
-        <w:pStyle w:val="Heading3"/>
       </w:pPr>
       <w:r>
         <w:t>Лекция 6. Режим холостого хода (ХХ) и измерительные трансформаторы напряжения (ТН)</w:t>
@@ -5050,7 +5050,7 @@
     </w:p>
     <w:p>
       <w:pPr>
-        <w:pStyle w:val="Heading3"/>
+        <w:pStyle w:val="Heading2"/>
       </w:pPr>
       <w:r>
         <w:t>Лекция 7. Режим короткого замыкания (КЗ) и измерительные трансформаторы тока (ТТ)</w:t>
@@ -5774,7 +5774,7 @@
     </w:p>
     <w:p>
       <w:pPr>
-        <w:pStyle w:val="Heading3"/>
+        <w:pStyle w:val="Heading2"/>
       </w:pPr>
       <w:r>
         <w:t>Лекция 8. Работа трансформатора под нагрузкой и коэффициент полезного действия (КПД)</w:t>
@@ -6459,15 +6459,15 @@
     </w:p>
     <w:p>
       <w:pPr>
+        <w:pStyle w:val="Heading1"/>
+      </w:pPr>
+      <w:r>
+        <w:t>Модуль IV. Многофазные системы, спецтрансформаторы, эксплуатация</w:t>
+      </w:r>
+    </w:p>
+    <w:p>
+      <w:pPr>
         <w:pStyle w:val="Heading2"/>
-      </w:pPr>
-      <w:r>
-        <w:t>Модуль IV. Многофазные системы, спецтрансформаторы, эксплуатация</w:t>
-      </w:r>
-    </w:p>
-    <w:p>
-      <w:pPr>
-        <w:pStyle w:val="Heading3"/>
       </w:pPr>
       <w:r>
         <w:t>Лекция 9. Трёхфазные трансформаторы и их соединения. Автотрансформаторы</w:t>
@@ -7083,7 +7083,7 @@
     </w:p>
     <w:p>
       <w:pPr>
-        <w:pStyle w:val="Heading3"/>
+        <w:pStyle w:val="Heading2"/>
       </w:pPr>
       <w:r>
         <w:t>Лекция 10. Параллельная работа, регулирование напряжения, переходные процессы и диагностика</w:t>

</xml_diff>

<commit_message>
Add figure support: image embedding in pipeline + 3 POC figures (schemes, phasor diagram, curves)
</commit_message>
<xml_diff>
--- a/Результаты/методичка_трансформаторы.docx
+++ b/Результаты/методичка_трансформаторы.docx
@@ -3519,6 +3519,60 @@
     </w:p>
     <w:p>
       <w:pPr>
+        <w:spacing w:before="240" w:after="120"/>
+        <w:jc w:val="center"/>
+      </w:pPr>
+      <w:r>
+        <w:drawing>
+          <wp:inline xmlns:a="http://schemas.openxmlformats.org/drawingml/2006/main" xmlns:pic="http://schemas.openxmlformats.org/drawingml/2006/picture">
+            <wp:extent cx="5400000" cy="2743023"/>
+            <wp:docPr id="1" name="Picture 1"/>
+            <wp:cNvGraphicFramePr>
+              <a:graphicFrameLocks noChangeAspect="1"/>
+            </wp:cNvGraphicFramePr>
+            <a:graphic>
+              <a:graphicData uri="http://schemas.openxmlformats.org/drawingml/2006/picture">
+                <pic:pic>
+                  <pic:nvPicPr>
+                    <pic:cNvPr id="0" name="fig_t_equiv.png"/>
+                    <pic:cNvPicPr/>
+                  </pic:nvPicPr>
+                  <pic:blipFill>
+                    <a:blip r:embed="rId9"/>
+                    <a:stretch>
+                      <a:fillRect/>
+                    </a:stretch>
+                  </pic:blipFill>
+                  <pic:spPr>
+                    <a:xfrm>
+                      <a:off x="0" y="0"/>
+                      <a:ext cx="5400000" cy="2743023"/>
+                    </a:xfrm>
+                    <a:prstGeom prst="rect"/>
+                  </pic:spPr>
+                </pic:pic>
+              </a:graphicData>
+            </a:graphic>
+          </wp:inline>
+        </w:drawing>
+      </w:r>
+    </w:p>
+    <w:p>
+      <w:pPr>
+        <w:spacing w:before="120" w:after="240"/>
+        <w:jc w:val="center"/>
+      </w:pPr>
+      <w:r>
+        <w:rPr>
+          <w:rFonts w:ascii="Times New Roman" w:hAnsi="Times New Roman"/>
+          <w:b w:val="0"/>
+          <w:sz w:val="28"/>
+        </w:rPr>
+        <w:t>Рисунок 1 — Т-образная схема замещения трансформатора (r₁, x₁ — параметры первичной обмотки; r₀, x₀ — ветвь намагничивания; r₂′, x₂′ — приведённые параметры вторичной обмотки)</w:t>
+      </w:r>
+    </w:p>
+    <w:p>
+      <w:pPr>
         <w:pStyle w:val="Heading3"/>
       </w:pPr>
       <w:r>
@@ -4502,6 +4556,60 @@
       <w:pPr/>
       <w:r>
         <w:t>Векторная диаграмма. Базовым вектором, от которого ведётся построение, является вектор амплитуды основного магнитного потока Φ_m, направленный вправо по оси абсцисс. Вектор тока холостого хода İ0 опережает вектор потока Φ_m на малый угол магнитных потерь δ, что математически учитывает отставание индукции от напряжённости магнитного поля из-за явления гистерезиса. Синусоидально изменяющийся поток Φ_m наводит в обмотках электродвижущие силы Ė1 и Ė2. Согласно закону электромагнитной индукции (и правилу Ленца), векторы этих ЭДС отстают от вектора потока строго на угол 90° и направлены вертикально вниз. Вектор первичного напряжения U̇1, уравновешивающий ЭДС Ė1, направлен вертикально вверх, находясь с ней в противофазе.</w:t>
+      </w:r>
+    </w:p>
+    <w:p>
+      <w:pPr>
+        <w:spacing w:before="240" w:after="120"/>
+        <w:jc w:val="center"/>
+      </w:pPr>
+      <w:r>
+        <w:drawing>
+          <wp:inline xmlns:a="http://schemas.openxmlformats.org/drawingml/2006/main" xmlns:pic="http://schemas.openxmlformats.org/drawingml/2006/picture">
+            <wp:extent cx="4754889" cy="4754889"/>
+            <wp:docPr id="2" name="Picture 2"/>
+            <wp:cNvGraphicFramePr>
+              <a:graphicFrameLocks noChangeAspect="1"/>
+            </wp:cNvGraphicFramePr>
+            <a:graphic>
+              <a:graphicData uri="http://schemas.openxmlformats.org/drawingml/2006/picture">
+                <pic:pic>
+                  <pic:nvPicPr>
+                    <pic:cNvPr id="0" name="fig_vd_xx.png"/>
+                    <pic:cNvPicPr/>
+                  </pic:nvPicPr>
+                  <pic:blipFill>
+                    <a:blip r:embed="rId10"/>
+                    <a:stretch>
+                      <a:fillRect/>
+                    </a:stretch>
+                  </pic:blipFill>
+                  <pic:spPr>
+                    <a:xfrm>
+                      <a:off x="0" y="0"/>
+                      <a:ext cx="4754889" cy="4754889"/>
+                    </a:xfrm>
+                    <a:prstGeom prst="rect"/>
+                  </pic:spPr>
+                </pic:pic>
+              </a:graphicData>
+            </a:graphic>
+          </wp:inline>
+        </w:drawing>
+      </w:r>
+    </w:p>
+    <w:p>
+      <w:pPr>
+        <w:spacing w:before="120" w:after="240"/>
+        <w:jc w:val="center"/>
+      </w:pPr>
+      <w:r>
+        <w:rPr>
+          <w:rFonts w:ascii="Times New Roman" w:hAnsi="Times New Roman"/>
+          <w:b w:val="0"/>
+          <w:sz w:val="28"/>
+        </w:rPr>
+        <w:t>Рисунок 2 — Векторная диаграмма трансформатора в режиме холостого хода (Φₘ — основной поток; İ₀ — ток ХХ, опережающий поток на угол потерь δ; Ė₁ = Ė₂ — ЭДС обмоток; U̇₁ — первичное напряжение)</w:t>
       </w:r>
     </w:p>
     <w:p>
@@ -5844,6 +5952,60 @@
     </w:p>
     <w:p>
       <w:pPr>
+        <w:spacing w:before="240" w:after="120"/>
+        <w:jc w:val="center"/>
+      </w:pPr>
+      <w:r>
+        <w:drawing>
+          <wp:inline xmlns:a="http://schemas.openxmlformats.org/drawingml/2006/main" xmlns:pic="http://schemas.openxmlformats.org/drawingml/2006/picture">
+            <wp:extent cx="5400000" cy="3780000"/>
+            <wp:docPr id="3" name="Picture 3"/>
+            <wp:cNvGraphicFramePr>
+              <a:graphicFrameLocks noChangeAspect="1"/>
+            </wp:cNvGraphicFramePr>
+            <a:graphic>
+              <a:graphicData uri="http://schemas.openxmlformats.org/drawingml/2006/picture">
+                <pic:pic>
+                  <pic:nvPicPr>
+                    <pic:cNvPr id="0" name="fig_ext_char.png"/>
+                    <pic:cNvPicPr/>
+                  </pic:nvPicPr>
+                  <pic:blipFill>
+                    <a:blip r:embed="rId11"/>
+                    <a:stretch>
+                      <a:fillRect/>
+                    </a:stretch>
+                  </pic:blipFill>
+                  <pic:spPr>
+                    <a:xfrm>
+                      <a:off x="0" y="0"/>
+                      <a:ext cx="5400000" cy="3780000"/>
+                    </a:xfrm>
+                    <a:prstGeom prst="rect"/>
+                  </pic:spPr>
+                </pic:pic>
+              </a:graphicData>
+            </a:graphic>
+          </wp:inline>
+        </w:drawing>
+      </w:r>
+    </w:p>
+    <w:p>
+      <w:pPr>
+        <w:spacing w:before="120" w:after="240"/>
+        <w:jc w:val="center"/>
+      </w:pPr>
+      <w:r>
+        <w:rPr>
+          <w:rFonts w:ascii="Times New Roman" w:hAnsi="Times New Roman"/>
+          <w:b w:val="0"/>
+          <w:sz w:val="28"/>
+        </w:rPr>
+        <w:t>Рисунок 3 — Внешние характеристики трансформатора U₂ = f(I₂) при активной, активно-индуктивной и активно-ёмкостной нагрузке</w:t>
+      </w:r>
+    </w:p>
+    <w:p>
+      <w:pPr>
         <w:pStyle w:val="Heading3"/>
       </w:pPr>
       <w:r>
@@ -7786,7 +7948,7 @@
       </w:r>
     </w:p>
     <w:sectPr>
-      <w:footerReference w:type="default" r:id="rId9"/>
+      <w:footerReference w:type="default" r:id="rId12"/>
       <w:pgSz w:w="11906" w:h="16838"/>
       <w:pgMar w:top="1134" w:right="850" w:bottom="1134" w:left="1701" w:header="720" w:footer="720" w:gutter="0"/>
       <w:cols w:space="720"/>

</xml_diff>

<commit_message>
Add all 19 figures to transformers guide (16 new schemes/diagrams/curves)
</commit_message>
<xml_diff>
--- a/Результаты/методичка_трансформаторы.docx
+++ b/Результаты/методичка_трансформаторы.docx
@@ -855,6 +855,60 @@
     </w:p>
     <w:p>
       <w:pPr>
+        <w:spacing w:before="240" w:after="120"/>
+        <w:jc w:val="center"/>
+      </w:pPr>
+      <w:r>
+        <w:drawing>
+          <wp:inline xmlns:a="http://schemas.openxmlformats.org/drawingml/2006/main" xmlns:pic="http://schemas.openxmlformats.org/drawingml/2006/picture">
+            <wp:extent cx="4148336" cy="3063246"/>
+            <wp:docPr id="1" name="Picture 1"/>
+            <wp:cNvGraphicFramePr>
+              <a:graphicFrameLocks noChangeAspect="1"/>
+            </wp:cNvGraphicFramePr>
+            <a:graphic>
+              <a:graphicData uri="http://schemas.openxmlformats.org/drawingml/2006/picture">
+                <pic:pic>
+                  <pic:nvPicPr>
+                    <pic:cNvPr id="0" name="fig_transformer_device.png"/>
+                    <pic:cNvPicPr/>
+                  </pic:nvPicPr>
+                  <pic:blipFill>
+                    <a:blip r:embed="rId9"/>
+                    <a:stretch>
+                      <a:fillRect/>
+                    </a:stretch>
+                  </pic:blipFill>
+                  <pic:spPr>
+                    <a:xfrm>
+                      <a:off x="0" y="0"/>
+                      <a:ext cx="4148336" cy="3063246"/>
+                    </a:xfrm>
+                    <a:prstGeom prst="rect"/>
+                  </pic:spPr>
+                </pic:pic>
+              </a:graphicData>
+            </a:graphic>
+          </wp:inline>
+        </w:drawing>
+      </w:r>
+    </w:p>
+    <w:p>
+      <w:pPr>
+        <w:spacing w:before="120" w:after="240"/>
+        <w:jc w:val="center"/>
+      </w:pPr>
+      <w:r>
+        <w:rPr>
+          <w:rFonts w:ascii="Times New Roman" w:hAnsi="Times New Roman"/>
+          <w:b w:val="0"/>
+          <w:sz w:val="28"/>
+        </w:rPr>
+        <w:t>Рисунок 1 — Принцип действия трансформатора: ферромагнитный магнитопровод, первичная (w₁) и вторичная (w₂) обмотки, основной магнитный поток Φ</w:t>
+      </w:r>
+    </w:p>
+    <w:p>
+      <w:pPr>
         <w:pStyle w:val="Heading3"/>
       </w:pPr>
       <w:r>
@@ -1160,6 +1214,60 @@
       <w:pPr/>
       <w:r>
         <w:t>Магнитопровод локализует поток Φ и снижает магнитное сопротивление. Типы: стержневые (обмотки охватывают стержни; основной тип — лучшее охлаждение и технологичность); броневые (магнитопровод охватывает обмотки снаружи; малая мощность, радиотехника); бронестержневые (для сверхмощных 100 МВ·А+, 220–500 кВ: боковые ярма разветвляют поток, снижая высоту аппарата под транспортный габарит). Сечение стержней мощных аппаратов — ступенчатое (многоугольник, вписанный в окружность). Шихтовка — сборка листов «в переплёт»; современный стандарт — косой стык 45° по схеме Step-lap (ступенчатое смещение стыков на 3–7 шагов), что снижает потери холостого хода.</w:t>
+      </w:r>
+    </w:p>
+    <w:p>
+      <w:pPr>
+        <w:spacing w:before="240" w:after="120"/>
+        <w:jc w:val="center"/>
+      </w:pPr>
+      <w:r>
+        <w:drawing>
+          <wp:inline xmlns:a="http://schemas.openxmlformats.org/drawingml/2006/main" xmlns:pic="http://schemas.openxmlformats.org/drawingml/2006/picture">
+            <wp:extent cx="5282194" cy="2785877"/>
+            <wp:docPr id="2" name="Picture 2"/>
+            <wp:cNvGraphicFramePr>
+              <a:graphicFrameLocks noChangeAspect="1"/>
+            </wp:cNvGraphicFramePr>
+            <a:graphic>
+              <a:graphicData uri="http://schemas.openxmlformats.org/drawingml/2006/picture">
+                <pic:pic>
+                  <pic:nvPicPr>
+                    <pic:cNvPr id="0" name="fig_core_types.png"/>
+                    <pic:cNvPicPr/>
+                  </pic:nvPicPr>
+                  <pic:blipFill>
+                    <a:blip r:embed="rId10"/>
+                    <a:stretch>
+                      <a:fillRect/>
+                    </a:stretch>
+                  </pic:blipFill>
+                  <pic:spPr>
+                    <a:xfrm>
+                      <a:off x="0" y="0"/>
+                      <a:ext cx="5282194" cy="2785877"/>
+                    </a:xfrm>
+                    <a:prstGeom prst="rect"/>
+                  </pic:spPr>
+                </pic:pic>
+              </a:graphicData>
+            </a:graphic>
+          </wp:inline>
+        </w:drawing>
+      </w:r>
+    </w:p>
+    <w:p>
+      <w:pPr>
+        <w:spacing w:before="120" w:after="240"/>
+        <w:jc w:val="center"/>
+      </w:pPr>
+      <w:r>
+        <w:rPr>
+          <w:rFonts w:ascii="Times New Roman" w:hAnsi="Times New Roman"/>
+          <w:b w:val="0"/>
+          <w:sz w:val="28"/>
+        </w:rPr>
+        <w:t>Рисунок 2 — Типы магнитопроводов: стержневой (обмотки на стержнях) и броневой (магнитопровод охватывает обмотки)</w:t>
       </w:r>
     </w:p>
     <w:p>
@@ -1329,6 +1437,60 @@
     </w:p>
     <w:p>
       <w:pPr>
+        <w:spacing w:before="240" w:after="120"/>
+        <w:jc w:val="center"/>
+      </w:pPr>
+      <w:r>
+        <w:drawing>
+          <wp:inline xmlns:a="http://schemas.openxmlformats.org/drawingml/2006/main" xmlns:pic="http://schemas.openxmlformats.org/drawingml/2006/picture">
+            <wp:extent cx="3928879" cy="3624078"/>
+            <wp:docPr id="3" name="Picture 3"/>
+            <wp:cNvGraphicFramePr>
+              <a:graphicFrameLocks noChangeAspect="1"/>
+            </wp:cNvGraphicFramePr>
+            <a:graphic>
+              <a:graphicData uri="http://schemas.openxmlformats.org/drawingml/2006/picture">
+                <pic:pic>
+                  <pic:nvPicPr>
+                    <pic:cNvPr id="0" name="fig_hysteresis.png"/>
+                    <pic:cNvPicPr/>
+                  </pic:nvPicPr>
+                  <pic:blipFill>
+                    <a:blip r:embed="rId11"/>
+                    <a:stretch>
+                      <a:fillRect/>
+                    </a:stretch>
+                  </pic:blipFill>
+                  <pic:spPr>
+                    <a:xfrm>
+                      <a:off x="0" y="0"/>
+                      <a:ext cx="3928879" cy="3624078"/>
+                    </a:xfrm>
+                    <a:prstGeom prst="rect"/>
+                  </pic:spPr>
+                </pic:pic>
+              </a:graphicData>
+            </a:graphic>
+          </wp:inline>
+        </w:drawing>
+      </w:r>
+    </w:p>
+    <w:p>
+      <w:pPr>
+        <w:spacing w:before="120" w:after="240"/>
+        <w:jc w:val="center"/>
+      </w:pPr>
+      <w:r>
+        <w:rPr>
+          <w:rFonts w:ascii="Times New Roman" w:hAnsi="Times New Roman"/>
+          <w:b w:val="0"/>
+          <w:sz w:val="28"/>
+        </w:rPr>
+        <w:t>Рисунок 3 — Петля гистерезиса B = f(H): индукция насыщения Bₛ, остаточная индукция Bᵣ, коэрцитивная сила Hᴄ</w:t>
+      </w:r>
+    </w:p>
+    <w:p>
+      <w:pPr>
         <w:pStyle w:val="Heading3"/>
       </w:pPr>
       <w:r>
@@ -1495,6 +1657,60 @@
       <w:pPr/>
       <w:r>
         <w:t>Цилиндрический сосуд над крышкой бака, компенсирует тепловое изменение объёма масла (ГОСТ: от −45 до +40 °C). Объём ≈ 9–10 % от объёма масла. Уменьшает площадь контакта масла с воздухом, защищая от окисления и увлажнения; дыхание — через силикагелевый воздухоосушитель.</w:t>
+      </w:r>
+    </w:p>
+    <w:p>
+      <w:pPr>
+        <w:spacing w:before="240" w:after="120"/>
+        <w:jc w:val="center"/>
+      </w:pPr>
+      <w:r>
+        <w:drawing>
+          <wp:inline xmlns:a="http://schemas.openxmlformats.org/drawingml/2006/main" xmlns:pic="http://schemas.openxmlformats.org/drawingml/2006/picture">
+            <wp:extent cx="3194310" cy="3419862"/>
+            <wp:docPr id="4" name="Picture 4"/>
+            <wp:cNvGraphicFramePr>
+              <a:graphicFrameLocks noChangeAspect="1"/>
+            </wp:cNvGraphicFramePr>
+            <a:graphic>
+              <a:graphicData uri="http://schemas.openxmlformats.org/drawingml/2006/picture">
+                <pic:pic>
+                  <pic:nvPicPr>
+                    <pic:cNvPr id="0" name="fig_cooling.png"/>
+                    <pic:cNvPicPr/>
+                  </pic:nvPicPr>
+                  <pic:blipFill>
+                    <a:blip r:embed="rId12"/>
+                    <a:stretch>
+                      <a:fillRect/>
+                    </a:stretch>
+                  </pic:blipFill>
+                  <pic:spPr>
+                    <a:xfrm>
+                      <a:off x="0" y="0"/>
+                      <a:ext cx="3194310" cy="3419862"/>
+                    </a:xfrm>
+                    <a:prstGeom prst="rect"/>
+                  </pic:spPr>
+                </pic:pic>
+              </a:graphicData>
+            </a:graphic>
+          </wp:inline>
+        </w:drawing>
+      </w:r>
+    </w:p>
+    <w:p>
+      <w:pPr>
+        <w:spacing w:before="120" w:after="240"/>
+        <w:jc w:val="center"/>
+      </w:pPr>
+      <w:r>
+        <w:rPr>
+          <w:rFonts w:ascii="Times New Roman" w:hAnsi="Times New Roman"/>
+          <w:b w:val="0"/>
+          <w:sz w:val="28"/>
+        </w:rPr>
+        <w:t>Рисунок 4 — Упрощённая конструкция масляного трансформатора: бак с маслом, активная часть, расширитель (консерватор), ввод ВН</w:t>
       </w:r>
     </w:p>
     <w:p>
@@ -2066,6 +2282,60 @@
     </w:p>
     <w:p>
       <w:pPr>
+        <w:spacing w:before="240" w:after="120"/>
+        <w:jc w:val="center"/>
+      </w:pPr>
+      <w:r>
+        <w:drawing>
+          <wp:inline xmlns:a="http://schemas.openxmlformats.org/drawingml/2006/main" xmlns:pic="http://schemas.openxmlformats.org/drawingml/2006/picture">
+            <wp:extent cx="3864871" cy="3139446"/>
+            <wp:docPr id="5" name="Picture 5"/>
+            <wp:cNvGraphicFramePr>
+              <a:graphicFrameLocks noChangeAspect="1"/>
+            </wp:cNvGraphicFramePr>
+            <a:graphic>
+              <a:graphicData uri="http://schemas.openxmlformats.org/drawingml/2006/picture">
+                <pic:pic>
+                  <pic:nvPicPr>
+                    <pic:cNvPr id="0" name="fig_leakage_flux.png"/>
+                    <pic:cNvPicPr/>
+                  </pic:nvPicPr>
+                  <pic:blipFill>
+                    <a:blip r:embed="rId13"/>
+                    <a:stretch>
+                      <a:fillRect/>
+                    </a:stretch>
+                  </pic:blipFill>
+                  <pic:spPr>
+                    <a:xfrm>
+                      <a:off x="0" y="0"/>
+                      <a:ext cx="3864871" cy="3139446"/>
+                    </a:xfrm>
+                    <a:prstGeom prst="rect"/>
+                  </pic:spPr>
+                </pic:pic>
+              </a:graphicData>
+            </a:graphic>
+          </wp:inline>
+        </w:drawing>
+      </w:r>
+    </w:p>
+    <w:p>
+      <w:pPr>
+        <w:spacing w:before="120" w:after="240"/>
+        <w:jc w:val="center"/>
+      </w:pPr>
+      <w:r>
+        <w:rPr>
+          <w:rFonts w:ascii="Times New Roman" w:hAnsi="Times New Roman"/>
+          <w:b w:val="0"/>
+          <w:sz w:val="28"/>
+        </w:rPr>
+        <w:t>Рисунок 5 — Основной магнитный поток Φ (по магнитопроводу) и потоки рассеяния Φσ₁, Φσ₂ (замыкаются по воздуху вокруг обмоток)</w:t>
+      </w:r>
+    </w:p>
+    <w:p>
+      <w:pPr>
         <w:pStyle w:val="Heading3"/>
       </w:pPr>
       <w:r>
@@ -3526,7 +3796,7 @@
         <w:drawing>
           <wp:inline xmlns:a="http://schemas.openxmlformats.org/drawingml/2006/main" xmlns:pic="http://schemas.openxmlformats.org/drawingml/2006/picture">
             <wp:extent cx="5400000" cy="2743023"/>
-            <wp:docPr id="1" name="Picture 1"/>
+            <wp:docPr id="6" name="Picture 6"/>
             <wp:cNvGraphicFramePr>
               <a:graphicFrameLocks noChangeAspect="1"/>
             </wp:cNvGraphicFramePr>
@@ -3538,7 +3808,7 @@
                     <pic:cNvPicPr/>
                   </pic:nvPicPr>
                   <pic:blipFill>
-                    <a:blip r:embed="rId9"/>
+                    <a:blip r:embed="rId14"/>
                     <a:stretch>
                       <a:fillRect/>
                     </a:stretch>
@@ -3568,7 +3838,7 @@
           <w:b w:val="0"/>
           <w:sz w:val="28"/>
         </w:rPr>
-        <w:t>Рисунок 1 — Т-образная схема замещения трансформатора (r₁, x₁ — параметры первичной обмотки; r₀, x₀ — ветвь намагничивания; r₂′, x₂′ — приведённые параметры вторичной обмотки)</w:t>
+        <w:t>Рисунок 6 — Т-образная схема замещения трансформатора (r₁, x₁ — параметры первичной обмотки; r₀, x₀ — ветвь намагничивания; r₂′, x₂′ — приведённые параметры вторичной обмотки)</w:t>
       </w:r>
     </w:p>
     <w:p>
@@ -3913,6 +4183,60 @@
     </w:p>
     <w:p>
       <w:pPr>
+        <w:spacing w:before="240" w:after="120"/>
+        <w:jc w:val="center"/>
+      </w:pPr>
+      <w:r>
+        <w:drawing>
+          <wp:inline xmlns:a="http://schemas.openxmlformats.org/drawingml/2006/main" xmlns:pic="http://schemas.openxmlformats.org/drawingml/2006/picture">
+            <wp:extent cx="3560071" cy="3419863"/>
+            <wp:docPr id="7" name="Picture 7"/>
+            <wp:cNvGraphicFramePr>
+              <a:graphicFrameLocks noChangeAspect="1"/>
+            </wp:cNvGraphicFramePr>
+            <a:graphic>
+              <a:graphicData uri="http://schemas.openxmlformats.org/drawingml/2006/picture">
+                <pic:pic>
+                  <pic:nvPicPr>
+                    <pic:cNvPr id="0" name="fig_three_winding.png"/>
+                    <pic:cNvPicPr/>
+                  </pic:nvPicPr>
+                  <pic:blipFill>
+                    <a:blip r:embed="rId15"/>
+                    <a:stretch>
+                      <a:fillRect/>
+                    </a:stretch>
+                  </pic:blipFill>
+                  <pic:spPr>
+                    <a:xfrm>
+                      <a:off x="0" y="0"/>
+                      <a:ext cx="3560071" cy="3419863"/>
+                    </a:xfrm>
+                    <a:prstGeom prst="rect"/>
+                  </pic:spPr>
+                </pic:pic>
+              </a:graphicData>
+            </a:graphic>
+          </wp:inline>
+        </w:drawing>
+      </w:r>
+    </w:p>
+    <w:p>
+      <w:pPr>
+        <w:spacing w:before="120" w:after="240"/>
+        <w:jc w:val="center"/>
+      </w:pPr>
+      <w:r>
+        <w:rPr>
+          <w:rFonts w:ascii="Times New Roman" w:hAnsi="Times New Roman"/>
+          <w:b w:val="0"/>
+          <w:sz w:val="28"/>
+        </w:rPr>
+        <w:t>Рисунок 7 — Схема замещения трёхобмоточного трансформатора — «трёхлучевая звезда» сопротивлений X_ВН, X_СН, X_НН</w:t>
+      </w:r>
+    </w:p>
+    <w:p>
+      <w:pPr>
         <w:pStyle w:val="Heading3"/>
       </w:pPr>
       <w:r>
@@ -4119,6 +4443,60 @@
           <w:sz w:val="28"/>
         </w:rPr>
         <w:t>Обработка и анализ. По полученным точкам строятся графические зависимости I0, P0, cosφ0 = f(U1). При превышении номинального напряжения ферромагнитный сердечник входит в зону насыщения, что отражается резким нелинейным возрастанием тока I0 на графике.</w:t>
+      </w:r>
+    </w:p>
+    <w:p>
+      <w:pPr>
+        <w:spacing w:before="240" w:after="120"/>
+        <w:jc w:val="center"/>
+      </w:pPr>
+      <w:r>
+        <w:drawing>
+          <wp:inline xmlns:a="http://schemas.openxmlformats.org/drawingml/2006/main" xmlns:pic="http://schemas.openxmlformats.org/drawingml/2006/picture">
+            <wp:extent cx="3672847" cy="2420117"/>
+            <wp:docPr id="8" name="Picture 8"/>
+            <wp:cNvGraphicFramePr>
+              <a:graphicFrameLocks noChangeAspect="1"/>
+            </wp:cNvGraphicFramePr>
+            <a:graphic>
+              <a:graphicData uri="http://schemas.openxmlformats.org/drawingml/2006/picture">
+                <pic:pic>
+                  <pic:nvPicPr>
+                    <pic:cNvPr id="0" name="fig_xx_test.png"/>
+                    <pic:cNvPicPr/>
+                  </pic:nvPicPr>
+                  <pic:blipFill>
+                    <a:blip r:embed="rId16"/>
+                    <a:stretch>
+                      <a:fillRect/>
+                    </a:stretch>
+                  </pic:blipFill>
+                  <pic:spPr>
+                    <a:xfrm>
+                      <a:off x="0" y="0"/>
+                      <a:ext cx="3672847" cy="2420117"/>
+                    </a:xfrm>
+                    <a:prstGeom prst="rect"/>
+                  </pic:spPr>
+                </pic:pic>
+              </a:graphicData>
+            </a:graphic>
+          </wp:inline>
+        </w:drawing>
+      </w:r>
+    </w:p>
+    <w:p>
+      <w:pPr>
+        <w:spacing w:before="120" w:after="240"/>
+        <w:jc w:val="center"/>
+      </w:pPr>
+      <w:r>
+        <w:rPr>
+          <w:rFonts w:ascii="Times New Roman" w:hAnsi="Times New Roman"/>
+          <w:b w:val="0"/>
+          <w:sz w:val="28"/>
+        </w:rPr>
+        <w:t>Рисунок 8 — Схема опыта холостого хода: источник U₁, амперметр, ваттметр, вторичная обмотка разомкнута (I₂ = 0)</w:t>
       </w:r>
     </w:p>
     <w:p>
@@ -4566,8 +4944,8 @@
       <w:r>
         <w:drawing>
           <wp:inline xmlns:a="http://schemas.openxmlformats.org/drawingml/2006/main" xmlns:pic="http://schemas.openxmlformats.org/drawingml/2006/picture">
-            <wp:extent cx="4754889" cy="4754889"/>
-            <wp:docPr id="2" name="Picture 2"/>
+            <wp:extent cx="3843535" cy="3843535"/>
+            <wp:docPr id="9" name="Picture 9"/>
             <wp:cNvGraphicFramePr>
               <a:graphicFrameLocks noChangeAspect="1"/>
             </wp:cNvGraphicFramePr>
@@ -4579,7 +4957,7 @@
                     <pic:cNvPicPr/>
                   </pic:nvPicPr>
                   <pic:blipFill>
-                    <a:blip r:embed="rId10"/>
+                    <a:blip r:embed="rId17"/>
                     <a:stretch>
                       <a:fillRect/>
                     </a:stretch>
@@ -4587,7 +4965,7 @@
                   <pic:spPr>
                     <a:xfrm>
                       <a:off x="0" y="0"/>
-                      <a:ext cx="4754889" cy="4754889"/>
+                      <a:ext cx="3843535" cy="3843535"/>
                     </a:xfrm>
                     <a:prstGeom prst="rect"/>
                   </pic:spPr>
@@ -4609,7 +4987,7 @@
           <w:b w:val="0"/>
           <w:sz w:val="28"/>
         </w:rPr>
-        <w:t>Рисунок 2 — Векторная диаграмма трансформатора в режиме холостого хода (Φₘ — основной поток; İ₀ — ток ХХ, опережающий поток на угол потерь δ; Ė₁ = Ė₂ — ЭДС обмоток; U̇₁ — первичное напряжение)</w:t>
+        <w:t>Рисунок 9 — Векторная диаграмма трансформатора в режиме холостого хода (Φₘ — основной поток; İ₀ — ток ХХ, опережающий поток на угол потерь δ; Ė₁ = Ė₂ — ЭДС обмоток; U̇₁ — первичное напряжение)</w:t>
       </w:r>
     </w:p>
     <w:p>
@@ -5316,6 +5694,60 @@
     </w:p>
     <w:p>
       <w:pPr>
+        <w:spacing w:before="240" w:after="120"/>
+        <w:jc w:val="center"/>
+      </w:pPr>
+      <w:r>
+        <w:drawing>
+          <wp:inline xmlns:a="http://schemas.openxmlformats.org/drawingml/2006/main" xmlns:pic="http://schemas.openxmlformats.org/drawingml/2006/picture">
+            <wp:extent cx="3352806" cy="2420116"/>
+            <wp:docPr id="10" name="Picture 10"/>
+            <wp:cNvGraphicFramePr>
+              <a:graphicFrameLocks noChangeAspect="1"/>
+            </wp:cNvGraphicFramePr>
+            <a:graphic>
+              <a:graphicData uri="http://schemas.openxmlformats.org/drawingml/2006/picture">
+                <pic:pic>
+                  <pic:nvPicPr>
+                    <pic:cNvPr id="0" name="fig_kz_test.png"/>
+                    <pic:cNvPicPr/>
+                  </pic:nvPicPr>
+                  <pic:blipFill>
+                    <a:blip r:embed="rId18"/>
+                    <a:stretch>
+                      <a:fillRect/>
+                    </a:stretch>
+                  </pic:blipFill>
+                  <pic:spPr>
+                    <a:xfrm>
+                      <a:off x="0" y="0"/>
+                      <a:ext cx="3352806" cy="2420116"/>
+                    </a:xfrm>
+                    <a:prstGeom prst="rect"/>
+                  </pic:spPr>
+                </pic:pic>
+              </a:graphicData>
+            </a:graphic>
+          </wp:inline>
+        </w:drawing>
+      </w:r>
+    </w:p>
+    <w:p>
+      <w:pPr>
+        <w:spacing w:before="120" w:after="240"/>
+        <w:jc w:val="center"/>
+      </w:pPr>
+      <w:r>
+        <w:rPr>
+          <w:rFonts w:ascii="Times New Roman" w:hAnsi="Times New Roman"/>
+          <w:b w:val="0"/>
+          <w:sz w:val="28"/>
+        </w:rPr>
+        <w:t>Рисунок 10 — Схема опыта короткого замыкания: пониженное напряжение U_к, вторичная обмотка замкнута накоротко (U₂ = 0)</w:t>
+      </w:r>
+    </w:p>
+    <w:p>
+      <w:pPr>
         <w:pStyle w:val="Heading3"/>
       </w:pPr>
       <w:r>
@@ -5680,6 +6112,60 @@
     </w:p>
     <w:p>
       <w:pPr>
+        <w:spacing w:before="240" w:after="120"/>
+        <w:jc w:val="center"/>
+      </w:pPr>
+      <w:r>
+        <w:drawing>
+          <wp:inline xmlns:a="http://schemas.openxmlformats.org/drawingml/2006/main" xmlns:pic="http://schemas.openxmlformats.org/drawingml/2006/picture">
+            <wp:extent cx="3867919" cy="2825501"/>
+            <wp:docPr id="11" name="Picture 11"/>
+            <wp:cNvGraphicFramePr>
+              <a:graphicFrameLocks noChangeAspect="1"/>
+            </wp:cNvGraphicFramePr>
+            <a:graphic>
+              <a:graphicData uri="http://schemas.openxmlformats.org/drawingml/2006/picture">
+                <pic:pic>
+                  <pic:nvPicPr>
+                    <pic:cNvPr id="0" name="fig_kapp_triangle.png"/>
+                    <pic:cNvPicPr/>
+                  </pic:nvPicPr>
+                  <pic:blipFill>
+                    <a:blip r:embed="rId19"/>
+                    <a:stretch>
+                      <a:fillRect/>
+                    </a:stretch>
+                  </pic:blipFill>
+                  <pic:spPr>
+                    <a:xfrm>
+                      <a:off x="0" y="0"/>
+                      <a:ext cx="3867919" cy="2825501"/>
+                    </a:xfrm>
+                    <a:prstGeom prst="rect"/>
+                  </pic:spPr>
+                </pic:pic>
+              </a:graphicData>
+            </a:graphic>
+          </wp:inline>
+        </w:drawing>
+      </w:r>
+    </w:p>
+    <w:p>
+      <w:pPr>
+        <w:spacing w:before="120" w:after="240"/>
+        <w:jc w:val="center"/>
+      </w:pPr>
+      <w:r>
+        <w:rPr>
+          <w:rFonts w:ascii="Times New Roman" w:hAnsi="Times New Roman"/>
+          <w:b w:val="0"/>
+          <w:sz w:val="28"/>
+        </w:rPr>
+        <w:t>Рисунок 11 — Треугольник напряжений короткого замыкания (треугольник Каппа): активная İ_к·r_к и индуктивная jİ_к·x_к составляющие, угол φ_к</w:t>
+      </w:r>
+    </w:p>
+    <w:p>
+      <w:pPr>
         <w:pStyle w:val="Heading3"/>
       </w:pPr>
       <w:r>
@@ -5702,6 +6188,60 @@
       <w:pPr/>
       <w:r>
         <w:t>Физика режима. Первичная обмотка ТТ (обычно состоящая из 1 или нескольких витков) включается в рассечку (последовательно) фазного провода ЛЭП. Вторичная обмотка замыкается на токовые катушки амперметров, ваттметров и реле защит. Внутреннее сопротивление этих приборов ничтожно мало (доли Ома). Следовательно, вторичная цепь практически замкнута накоротко, и рабочим режимом ТТ является режим короткого замыкания. По ГОСТ номинальный вторичный ток ТТ жёстко стандартизирован и равен 5 А или 1 А.</w:t>
+      </w:r>
+    </w:p>
+    <w:p>
+      <w:pPr>
+        <w:spacing w:before="240" w:after="120"/>
+        <w:jc w:val="center"/>
+      </w:pPr>
+      <w:r>
+        <w:drawing>
+          <wp:inline xmlns:a="http://schemas.openxmlformats.org/drawingml/2006/main" xmlns:pic="http://schemas.openxmlformats.org/drawingml/2006/picture">
+            <wp:extent cx="3355854" cy="923546"/>
+            <wp:docPr id="12" name="Picture 12"/>
+            <wp:cNvGraphicFramePr>
+              <a:graphicFrameLocks noChangeAspect="1"/>
+            </wp:cNvGraphicFramePr>
+            <a:graphic>
+              <a:graphicData uri="http://schemas.openxmlformats.org/drawingml/2006/picture">
+                <pic:pic>
+                  <pic:nvPicPr>
+                    <pic:cNvPr id="0" name="fig_ct_connection.png"/>
+                    <pic:cNvPicPr/>
+                  </pic:nvPicPr>
+                  <pic:blipFill>
+                    <a:blip r:embed="rId20"/>
+                    <a:stretch>
+                      <a:fillRect/>
+                    </a:stretch>
+                  </pic:blipFill>
+                  <pic:spPr>
+                    <a:xfrm>
+                      <a:off x="0" y="0"/>
+                      <a:ext cx="3355854" cy="923546"/>
+                    </a:xfrm>
+                    <a:prstGeom prst="rect"/>
+                  </pic:spPr>
+                </pic:pic>
+              </a:graphicData>
+            </a:graphic>
+          </wp:inline>
+        </w:drawing>
+      </w:r>
+    </w:p>
+    <w:p>
+      <w:pPr>
+        <w:spacing w:before="120" w:after="240"/>
+        <w:jc w:val="center"/>
+      </w:pPr>
+      <w:r>
+        <w:rPr>
+          <w:rFonts w:ascii="Times New Roman" w:hAnsi="Times New Roman"/>
+          <w:b w:val="0"/>
+          <w:sz w:val="28"/>
+        </w:rPr>
+        <w:t>Рисунок 12 — Включение трансформатора тока (ТТ): первичная обмотка в рассечку линии, вторичная замкнута на амперметр/реле (5 А)</w:t>
       </w:r>
     </w:p>
     <w:p>
@@ -5958,8 +6498,8 @@
       <w:r>
         <w:drawing>
           <wp:inline xmlns:a="http://schemas.openxmlformats.org/drawingml/2006/main" xmlns:pic="http://schemas.openxmlformats.org/drawingml/2006/picture">
-            <wp:extent cx="5400000" cy="3780000"/>
-            <wp:docPr id="3" name="Picture 3"/>
+            <wp:extent cx="5187706" cy="3584455"/>
+            <wp:docPr id="13" name="Picture 13"/>
             <wp:cNvGraphicFramePr>
               <a:graphicFrameLocks noChangeAspect="1"/>
             </wp:cNvGraphicFramePr>
@@ -5971,7 +6511,7 @@
                     <pic:cNvPicPr/>
                   </pic:nvPicPr>
                   <pic:blipFill>
-                    <a:blip r:embed="rId11"/>
+                    <a:blip r:embed="rId21"/>
                     <a:stretch>
                       <a:fillRect/>
                     </a:stretch>
@@ -5979,7 +6519,7 @@
                   <pic:spPr>
                     <a:xfrm>
                       <a:off x="0" y="0"/>
-                      <a:ext cx="5400000" cy="3780000"/>
+                      <a:ext cx="5187706" cy="3584455"/>
                     </a:xfrm>
                     <a:prstGeom prst="rect"/>
                   </pic:spPr>
@@ -6001,7 +6541,7 @@
           <w:b w:val="0"/>
           <w:sz w:val="28"/>
         </w:rPr>
-        <w:t>Рисунок 3 — Внешние характеристики трансформатора U₂ = f(I₂) при активной, активно-индуктивной и активно-ёмкостной нагрузке</w:t>
+        <w:t>Рисунок 13 — Внешние характеристики трансформатора U₂ = f(I₂) при активной, активно-индуктивной и активно-ёмкостной нагрузке</w:t>
       </w:r>
     </w:p>
     <w:p>
@@ -6389,6 +6929,60 @@
     </w:p>
     <w:p>
       <w:pPr>
+        <w:spacing w:before="240" w:after="120"/>
+        <w:jc w:val="center"/>
+      </w:pPr>
+      <w:r>
+        <w:drawing>
+          <wp:inline xmlns:a="http://schemas.openxmlformats.org/drawingml/2006/main" xmlns:pic="http://schemas.openxmlformats.org/drawingml/2006/picture">
+            <wp:extent cx="5041402" cy="3441199"/>
+            <wp:docPr id="14" name="Picture 14"/>
+            <wp:cNvGraphicFramePr>
+              <a:graphicFrameLocks noChangeAspect="1"/>
+            </wp:cNvGraphicFramePr>
+            <a:graphic>
+              <a:graphicData uri="http://schemas.openxmlformats.org/drawingml/2006/picture">
+                <pic:pic>
+                  <pic:nvPicPr>
+                    <pic:cNvPr id="0" name="fig_efficiency.png"/>
+                    <pic:cNvPicPr/>
+                  </pic:nvPicPr>
+                  <pic:blipFill>
+                    <a:blip r:embed="rId22"/>
+                    <a:stretch>
+                      <a:fillRect/>
+                    </a:stretch>
+                  </pic:blipFill>
+                  <pic:spPr>
+                    <a:xfrm>
+                      <a:off x="0" y="0"/>
+                      <a:ext cx="5041402" cy="3441199"/>
+                    </a:xfrm>
+                    <a:prstGeom prst="rect"/>
+                  </pic:spPr>
+                </pic:pic>
+              </a:graphicData>
+            </a:graphic>
+          </wp:inline>
+        </w:drawing>
+      </w:r>
+    </w:p>
+    <w:p>
+      <w:pPr>
+        <w:spacing w:before="120" w:after="240"/>
+        <w:jc w:val="center"/>
+      </w:pPr>
+      <w:r>
+        <w:rPr>
+          <w:rFonts w:ascii="Times New Roman" w:hAnsi="Times New Roman"/>
+          <w:b w:val="0"/>
+          <w:sz w:val="28"/>
+        </w:rPr>
+        <w:t>Рисунок 14 — Зависимость КПД от коэффициента загрузки η = f(β); максимум при β_opt = √(P_xx/P_k)</w:t>
+      </w:r>
+    </w:p>
+    <w:p>
+      <w:pPr>
         <w:pStyle w:val="Heading3"/>
       </w:pPr>
       <w:r>
@@ -6770,6 +7364,60 @@
     </w:p>
     <w:p>
       <w:pPr>
+        <w:spacing w:before="240" w:after="120"/>
+        <w:jc w:val="center"/>
+      </w:pPr>
+      <w:r>
+        <w:drawing>
+          <wp:inline xmlns:a="http://schemas.openxmlformats.org/drawingml/2006/main" xmlns:pic="http://schemas.openxmlformats.org/drawingml/2006/picture">
+            <wp:extent cx="5400000" cy="1818777"/>
+            <wp:docPr id="15" name="Picture 15"/>
+            <wp:cNvGraphicFramePr>
+              <a:graphicFrameLocks noChangeAspect="1"/>
+            </wp:cNvGraphicFramePr>
+            <a:graphic>
+              <a:graphicData uri="http://schemas.openxmlformats.org/drawingml/2006/picture">
+                <pic:pic>
+                  <pic:nvPicPr>
+                    <pic:cNvPr id="0" name="fig_connections_ydz.png"/>
+                    <pic:cNvPicPr/>
+                  </pic:nvPicPr>
+                  <pic:blipFill>
+                    <a:blip r:embed="rId23"/>
+                    <a:stretch>
+                      <a:fillRect/>
+                    </a:stretch>
+                  </pic:blipFill>
+                  <pic:spPr>
+                    <a:xfrm>
+                      <a:off x="0" y="0"/>
+                      <a:ext cx="5400000" cy="1818777"/>
+                    </a:xfrm>
+                    <a:prstGeom prst="rect"/>
+                  </pic:spPr>
+                </pic:pic>
+              </a:graphicData>
+            </a:graphic>
+          </wp:inline>
+        </w:drawing>
+      </w:r>
+    </w:p>
+    <w:p>
+      <w:pPr>
+        <w:spacing w:before="120" w:after="240"/>
+        <w:jc w:val="center"/>
+      </w:pPr>
+      <w:r>
+        <w:rPr>
+          <w:rFonts w:ascii="Times New Roman" w:hAnsi="Times New Roman"/>
+          <w:b w:val="0"/>
+          <w:sz w:val="28"/>
+        </w:rPr>
+        <w:t>Рисунок 15 — Схемы соединения обмоток трёхфазного трансформатора: звезда (Y), треугольник (Δ), зигзаг (Z)</w:t>
+      </w:r>
+    </w:p>
+    <w:p>
+      <w:pPr>
         <w:pStyle w:val="Heading3"/>
       </w:pPr>
       <w:r>
@@ -6918,6 +7566,60 @@
     </w:p>
     <w:p>
       <w:pPr>
+        <w:spacing w:before="240" w:after="120"/>
+        <w:jc w:val="center"/>
+      </w:pPr>
+      <w:r>
+        <w:drawing>
+          <wp:inline xmlns:a="http://schemas.openxmlformats.org/drawingml/2006/main" xmlns:pic="http://schemas.openxmlformats.org/drawingml/2006/picture">
+            <wp:extent cx="3419862" cy="3419862"/>
+            <wp:docPr id="16" name="Picture 16"/>
+            <wp:cNvGraphicFramePr>
+              <a:graphicFrameLocks noChangeAspect="1"/>
+            </wp:cNvGraphicFramePr>
+            <a:graphic>
+              <a:graphicData uri="http://schemas.openxmlformats.org/drawingml/2006/picture">
+                <pic:pic>
+                  <pic:nvPicPr>
+                    <pic:cNvPr id="0" name="fig_clock_groups.png"/>
+                    <pic:cNvPicPr/>
+                  </pic:nvPicPr>
+                  <pic:blipFill>
+                    <a:blip r:embed="rId24"/>
+                    <a:stretch>
+                      <a:fillRect/>
+                    </a:stretch>
+                  </pic:blipFill>
+                  <pic:spPr>
+                    <a:xfrm>
+                      <a:off x="0" y="0"/>
+                      <a:ext cx="3419862" cy="3419862"/>
+                    </a:xfrm>
+                    <a:prstGeom prst="rect"/>
+                  </pic:spPr>
+                </pic:pic>
+              </a:graphicData>
+            </a:graphic>
+          </wp:inline>
+        </w:drawing>
+      </w:r>
+    </w:p>
+    <w:p>
+      <w:pPr>
+        <w:spacing w:before="120" w:after="240"/>
+        <w:jc w:val="center"/>
+      </w:pPr>
+      <w:r>
+        <w:rPr>
+          <w:rFonts w:ascii="Times New Roman" w:hAnsi="Times New Roman"/>
+          <w:b w:val="0"/>
+          <w:sz w:val="28"/>
+        </w:rPr>
+        <w:t>Рисунок 16 — Определение группы соединения по «часовому циферблату»: вектор ВН на 12, вектор НН указывает номер группы (показана группа 11)</w:t>
+      </w:r>
+    </w:p>
+    <w:p>
+      <w:pPr>
         <w:pStyle w:val="Heading3"/>
       </w:pPr>
       <w:r>
@@ -6964,6 +7666,60 @@
       <w:pPr/>
       <w:r>
         <w:t>В системном контексте гальваническая связь создаёт значительный энергетический эффект: мощность передаётся потребителю двумя путями.</w:t>
+      </w:r>
+    </w:p>
+    <w:p>
+      <w:pPr>
+        <w:spacing w:before="240" w:after="120"/>
+        <w:jc w:val="center"/>
+      </w:pPr>
+      <w:r>
+        <w:drawing>
+          <wp:inline xmlns:a="http://schemas.openxmlformats.org/drawingml/2006/main" xmlns:pic="http://schemas.openxmlformats.org/drawingml/2006/picture">
+            <wp:extent cx="1581915" cy="3288798"/>
+            <wp:docPr id="17" name="Picture 17"/>
+            <wp:cNvGraphicFramePr>
+              <a:graphicFrameLocks noChangeAspect="1"/>
+            </wp:cNvGraphicFramePr>
+            <a:graphic>
+              <a:graphicData uri="http://schemas.openxmlformats.org/drawingml/2006/picture">
+                <pic:pic>
+                  <pic:nvPicPr>
+                    <pic:cNvPr id="0" name="fig_autotransformer.png"/>
+                    <pic:cNvPicPr/>
+                  </pic:nvPicPr>
+                  <pic:blipFill>
+                    <a:blip r:embed="rId25"/>
+                    <a:stretch>
+                      <a:fillRect/>
+                    </a:stretch>
+                  </pic:blipFill>
+                  <pic:spPr>
+                    <a:xfrm>
+                      <a:off x="0" y="0"/>
+                      <a:ext cx="1581915" cy="3288798"/>
+                    </a:xfrm>
+                    <a:prstGeom prst="rect"/>
+                  </pic:spPr>
+                </pic:pic>
+              </a:graphicData>
+            </a:graphic>
+          </wp:inline>
+        </w:drawing>
+      </w:r>
+    </w:p>
+    <w:p>
+      <w:pPr>
+        <w:spacing w:before="120" w:after="240"/>
+        <w:jc w:val="center"/>
+      </w:pPr>
+      <w:r>
+        <w:rPr>
+          <w:rFonts w:ascii="Times New Roman" w:hAnsi="Times New Roman"/>
+          <w:b w:val="0"/>
+          <w:sz w:val="28"/>
+        </w:rPr>
+        <w:t>Рисунок 17 — Схема понижающего автотрансформатора: последовательная и общая обмотки, гальваническая связь ВН и НН</w:t>
       </w:r>
     </w:p>
     <w:p>
@@ -7568,6 +8324,60 @@
       </w:r>
     </w:p>
     <w:p>
+      <w:pPr>
+        <w:spacing w:before="240" w:after="120"/>
+        <w:jc w:val="center"/>
+      </w:pPr>
+      <w:r>
+        <w:drawing>
+          <wp:inline xmlns:a="http://schemas.openxmlformats.org/drawingml/2006/main" xmlns:pic="http://schemas.openxmlformats.org/drawingml/2006/picture">
+            <wp:extent cx="5111506" cy="3160782"/>
+            <wp:docPr id="18" name="Picture 18"/>
+            <wp:cNvGraphicFramePr>
+              <a:graphicFrameLocks noChangeAspect="1"/>
+            </wp:cNvGraphicFramePr>
+            <a:graphic>
+              <a:graphicData uri="http://schemas.openxmlformats.org/drawingml/2006/picture">
+                <pic:pic>
+                  <pic:nvPicPr>
+                    <pic:cNvPr id="0" name="fig_inrush.png"/>
+                    <pic:cNvPicPr/>
+                  </pic:nvPicPr>
+                  <pic:blipFill>
+                    <a:blip r:embed="rId26"/>
+                    <a:stretch>
+                      <a:fillRect/>
+                    </a:stretch>
+                  </pic:blipFill>
+                  <pic:spPr>
+                    <a:xfrm>
+                      <a:off x="0" y="0"/>
+                      <a:ext cx="5111506" cy="3160782"/>
+                    </a:xfrm>
+                    <a:prstGeom prst="rect"/>
+                  </pic:spPr>
+                </pic:pic>
+              </a:graphicData>
+            </a:graphic>
+          </wp:inline>
+        </w:drawing>
+      </w:r>
+    </w:p>
+    <w:p>
+      <w:pPr>
+        <w:spacing w:before="120" w:after="240"/>
+        <w:jc w:val="center"/>
+      </w:pPr>
+      <w:r>
+        <w:rPr>
+          <w:rFonts w:ascii="Times New Roman" w:hAnsi="Times New Roman"/>
+          <w:b w:val="0"/>
+          <w:sz w:val="28"/>
+        </w:rPr>
+        <w:t>Рисунок 18 — Бросок тока намагничивания при включении трансформатора: пикообразный односторонний ток до 6–8 I_ном с апериодической составляющей</w:t>
+      </w:r>
+    </w:p>
+    <w:p>
       <w:pPr/>
       <w:r>
         <w:t>Б. Внезапное короткое замыкание. Если эксплуатационное короткое замыкание происходит внезапно при номинальном напряжении сети, возникает тяжелейший аварийный процесс. Наряду с периодическим током КЗ (I_k), определяемым сопротивлением схемы замещения Z_k, возникает экспоненциально затухающий апериодический ток. Максимальное мгновенное значение полного тока достигается примерно через половину периода (0,01 с при 50 Гц) после начала КЗ и называется ударным током (i_уд):</w:t>
@@ -7659,6 +8469,60 @@
     </w:p>
     <w:p>
       <w:pPr>
+        <w:spacing w:before="240" w:after="120"/>
+        <w:jc w:val="center"/>
+      </w:pPr>
+      <w:r>
+        <w:drawing>
+          <wp:inline xmlns:a="http://schemas.openxmlformats.org/drawingml/2006/main" xmlns:pic="http://schemas.openxmlformats.org/drawingml/2006/picture">
+            <wp:extent cx="5020066" cy="3160782"/>
+            <wp:docPr id="19" name="Picture 19"/>
+            <wp:cNvGraphicFramePr>
+              <a:graphicFrameLocks noChangeAspect="1"/>
+            </wp:cNvGraphicFramePr>
+            <a:graphic>
+              <a:graphicData uri="http://schemas.openxmlformats.org/drawingml/2006/picture">
+                <pic:pic>
+                  <pic:nvPicPr>
+                    <pic:cNvPr id="0" name="fig_shock_current.png"/>
+                    <pic:cNvPicPr/>
+                  </pic:nvPicPr>
+                  <pic:blipFill>
+                    <a:blip r:embed="rId27"/>
+                    <a:stretch>
+                      <a:fillRect/>
+                    </a:stretch>
+                  </pic:blipFill>
+                  <pic:spPr>
+                    <a:xfrm>
+                      <a:off x="0" y="0"/>
+                      <a:ext cx="5020066" cy="3160782"/>
+                    </a:xfrm>
+                    <a:prstGeom prst="rect"/>
+                  </pic:spPr>
+                </pic:pic>
+              </a:graphicData>
+            </a:graphic>
+          </wp:inline>
+        </w:drawing>
+      </w:r>
+    </w:p>
+    <w:p>
+      <w:pPr>
+        <w:spacing w:before="120" w:after="240"/>
+        <w:jc w:val="center"/>
+      </w:pPr>
+      <w:r>
+        <w:rPr>
+          <w:rFonts w:ascii="Times New Roman" w:hAnsi="Times New Roman"/>
+          <w:b w:val="0"/>
+          <w:sz w:val="28"/>
+        </w:rPr>
+        <w:t>Рисунок 19 — Ток внезапного короткого замыкания: периодическая и затухающая апериодическая составляющие, ударный ток i_уд при t ≈ 0,01 с</w:t>
+      </w:r>
+    </w:p>
+    <w:p>
+      <w:pPr>
         <w:pStyle w:val="Heading3"/>
       </w:pPr>
       <w:r>
@@ -7948,7 +8812,7 @@
       </w:r>
     </w:p>
     <w:sectPr>
-      <w:footerReference w:type="default" r:id="rId12"/>
+      <w:footerReference w:type="default" r:id="rId28"/>
       <w:pgSz w:w="11906" w:h="16838"/>
       <w:pgMar w:top="1134" w:right="850" w:bottom="1134" w:left="1701" w:header="720" w:footer="720" w:gutter="0"/>
       <w:cols w:space="720"/>

</xml_diff>